<commit_message>
memperbaiki output format dokumen
</commit_message>
<xml_diff>
--- a/resources/templates/kak_template_merged.docx
+++ b/resources/templates/kak_template_merged.docx
@@ -184,16 +184,25 @@
     <w:p>
       <w:pPr>
         <w:spacing w:after="0" w:lineRule="auto"/>
-        <w:rPr>
-          <w:rFonts w:ascii="Arial" w:cs="Arial" w:eastAsia="Arial" w:hAnsi="Arial"/>
-          <w:sz w:val="22"/>
-          <w:szCs w:val="22"/>
-        </w:rPr>
-      </w:pPr>
-      <w:r>
-        <w:rPr>
-          <w:rtl w:val="0"/>
-        </w:rPr>
+        <w:jc w:val="center"/>
+        <w:rPr>
+          <w:rFonts w:ascii="Arial" w:cs="Arial" w:eastAsia="Arial" w:hAnsi="Arial"/>
+          <w:b w:val="1"/>
+          <w:bCs w:val="1"/>
+          <w:sz w:val="22"/>
+          <w:szCs w:val="22"/>
+        </w:rPr>
+      </w:pPr>
+      <w:r>
+        <w:rPr>
+          <w:rFonts w:ascii="Arial" w:cs="Arial" w:eastAsia="Arial" w:hAnsi="Arial"/>
+          <w:b w:val="1"/>
+          <w:bCs w:val="1"/>
+          <w:sz w:val="22"/>
+          <w:szCs w:val="22"/>
+          <w:rtl w:val="0"/>
+        </w:rPr>
+        <w:t xml:space="preserve">KERANGKA ACUAN KEGIATAN (KAK)</w:t>
       </w:r>
     </w:p>
     <w:p>
@@ -206,6 +215,7 @@
           <w:bCs w:val="1"/>
           <w:sz w:val="22"/>
           <w:szCs w:val="22"/>
+          <w:highlight w:val="yellow"/>
         </w:rPr>
       </w:pPr>
       <w:r>
@@ -217,7 +227,19 @@
           <w:szCs w:val="22"/>
           <w:rtl w:val="0"/>
         </w:rPr>
-        <w:t xml:space="preserve">KERANGKA ACUAN KEGIATAN (KAK)</w:t>
+        <w:t xml:space="preserve">ASISTEN DEPUTI </w:t>
+      </w:r>
+      <w:r>
+        <w:rPr>
+          <w:rFonts w:ascii="Arial" w:cs="Arial" w:eastAsia="Arial" w:hAnsi="Arial"/>
+          <w:b w:val="1"/>
+          <w:bCs w:val="1"/>
+          <w:sz w:val="22"/>
+          <w:szCs w:val="22"/>
+          <w:highlight w:val="yellow"/>
+          <w:rtl w:val="0"/>
+        </w:rPr>
+        <w:t>${field_001}</w:t>
       </w:r>
     </w:p>
     <w:p>
@@ -242,7 +264,7 @@
           <w:szCs w:val="22"/>
           <w:rtl w:val="0"/>
         </w:rPr>
-        <w:t xml:space="preserve">ASISTEN DEPUTI </w:t>
+        <w:t xml:space="preserve">TAHUN </w:t>
       </w:r>
       <w:r>
         <w:rPr>
@@ -254,7 +276,7 @@
           <w:highlight w:val="yellow"/>
           <w:rtl w:val="0"/>
         </w:rPr>
-        <w:t>${field_001}</w:t>
+        <w:t>${field_002}</w:t>
       </w:r>
     </w:p>
     <w:p>
@@ -267,20 +289,26 @@
           <w:bCs w:val="1"/>
           <w:sz w:val="22"/>
           <w:szCs w:val="22"/>
-          <w:highlight w:val="yellow"/>
-        </w:rPr>
-      </w:pPr>
-      <w:r>
+        </w:rPr>
+      </w:pPr>
+      <w:r>
+        <w:rPr>
+          <w:rtl w:val="0"/>
+        </w:rPr>
+      </w:r>
+    </w:p>
+    <w:p>
+      <w:pPr>
+        <w:spacing w:after="0" w:lineRule="auto"/>
+        <w:jc w:val="center"/>
         <w:rPr>
           <w:rFonts w:ascii="Arial" w:cs="Arial" w:eastAsia="Arial" w:hAnsi="Arial"/>
           <w:b w:val="1"/>
           <w:bCs w:val="1"/>
           <w:sz w:val="22"/>
           <w:szCs w:val="22"/>
-          <w:rtl w:val="0"/>
-        </w:rPr>
-        <w:t xml:space="preserve">TAHUN </w:t>
-      </w:r>
+        </w:rPr>
+      </w:pPr>
       <w:r>
         <w:rPr>
           <w:rFonts w:ascii="Arial" w:cs="Arial" w:eastAsia="Arial" w:hAnsi="Arial"/>
@@ -288,10 +316,9 @@
           <w:bCs w:val="1"/>
           <w:sz w:val="22"/>
           <w:szCs w:val="22"/>
-          <w:highlight w:val="yellow"/>
-          <w:rtl w:val="0"/>
-        </w:rPr>
-        <w:t>${field_002}</w:t>
+          <w:rtl w:val="0"/>
+        </w:rPr>
+        <w:t xml:space="preserve">RINCIAN OUTPUT (RO):</w:t>
       </w:r>
     </w:p>
     <w:p>
@@ -308,6 +335,29 @@
       </w:pPr>
       <w:r>
         <w:rPr>
+          <w:rFonts w:ascii="Arial" w:cs="Arial" w:eastAsia="Arial" w:hAnsi="Arial"/>
+          <w:b w:val="1"/>
+          <w:bCs w:val="1"/>
+          <w:sz w:val="22"/>
+          <w:szCs w:val="22"/>
+          <w:rtl w:val="0"/>
+        </w:rPr>
+        <w:t xml:space="preserve">REKOMENDASI ALTERNATIF KEBIJAKAN </w:t>
+      </w:r>
+      <w:r>
+        <w:rPr>
+          <w:rFonts w:ascii="Arial" w:cs="Arial" w:eastAsia="Arial" w:hAnsi="Arial"/>
+          <w:b w:val="1"/>
+          <w:bCs w:val="1"/>
+          <w:sz w:val="22"/>
+          <w:szCs w:val="22"/>
+          <w:highlight w:val="yellow"/>
+          <w:rtl w:val="0"/>
+        </w:rPr>
+        <w:t>${field_003}</w:t>
+      </w:r>
+      <w:r>
+        <w:rPr>
           <w:rtl w:val="0"/>
         </w:rPr>
       </w:r>
@@ -333,7 +383,30 @@
           <w:szCs w:val="22"/>
           <w:rtl w:val="0"/>
         </w:rPr>
-        <w:t xml:space="preserve">RINCIAN OUTPUT (RO):</w:t>
+        <w:t xml:space="preserve">(</w:t>
+      </w:r>
+      <w:r>
+        <w:rPr>
+          <w:rFonts w:ascii="Arial" w:cs="Arial" w:eastAsia="Arial" w:hAnsi="Arial"/>
+          <w:b w:val="1"/>
+          <w:bCs w:val="1"/>
+          <w:sz w:val="22"/>
+          <w:szCs w:val="22"/>
+          <w:highlight w:val="yellow"/>
+          <w:rtl w:val="0"/>
+        </w:rPr>
+        <w:t>${field_004}</w:t>
+      </w:r>
+      <w:r>
+        <w:rPr>
+          <w:rFonts w:ascii="Arial" w:cs="Arial" w:eastAsia="Arial" w:hAnsi="Arial"/>
+          <w:b w:val="1"/>
+          <w:bCs w:val="1"/>
+          <w:sz w:val="22"/>
+          <w:szCs w:val="22"/>
+          <w:rtl w:val="0"/>
+        </w:rPr>
+        <w:t xml:space="preserve">)</w:t>
       </w:r>
     </w:p>
     <w:p>
@@ -350,14 +423,84 @@
       </w:pPr>
       <w:r>
         <w:rPr>
+          <w:rtl w:val="0"/>
+        </w:rPr>
+      </w:r>
+    </w:p>
+    <w:p>
+      <w:pPr>
+        <w:spacing w:after="0" w:lineRule="auto"/>
+        <w:jc w:val="center"/>
+        <w:rPr>
+          <w:rFonts w:ascii="Arial" w:cs="Arial" w:eastAsia="Arial" w:hAnsi="Arial"/>
+          <w:sz w:val="22"/>
+          <w:szCs w:val="22"/>
+        </w:rPr>
+      </w:pPr>
+      <w:r>
+        <w:rPr>
+          <w:rFonts w:ascii="Arial" w:cs="Arial" w:eastAsia="Arial" w:hAnsi="Arial"/>
+          <w:sz w:val="22"/>
+          <w:szCs w:val="22"/>
+          <w:rtl w:val="0"/>
+        </w:rPr>
+        <w:t xml:space="preserve">KLASIFIKASI RINCIAN OUTPUT (KRO):</w:t>
+      </w:r>
+    </w:p>
+    <w:p>
+      <w:pPr>
+        <w:spacing w:after="0" w:lineRule="auto"/>
+        <w:jc w:val="center"/>
+        <w:rPr>
+          <w:rFonts w:ascii="Arial" w:cs="Arial" w:eastAsia="Arial" w:hAnsi="Arial"/>
+          <w:sz w:val="22"/>
+          <w:szCs w:val="22"/>
+        </w:rPr>
+      </w:pPr>
+      <w:r>
+        <w:rPr>
+          <w:rFonts w:ascii="Arial" w:cs="Arial" w:eastAsia="Arial" w:hAnsi="Arial"/>
+          <w:sz w:val="22"/>
+          <w:szCs w:val="22"/>
+          <w:rtl w:val="0"/>
+        </w:rPr>
+        <w:t xml:space="preserve">Kebijakan Bidang </w:t>
+      </w:r>
+      <w:r>
+        <w:rPr>
           <w:rFonts w:ascii="Arial" w:cs="Arial" w:eastAsia="Arial" w:hAnsi="Arial"/>
           <w:b w:val="1"/>
           <w:bCs w:val="1"/>
           <w:sz w:val="22"/>
           <w:szCs w:val="22"/>
-          <w:rtl w:val="0"/>
-        </w:rPr>
-        <w:t xml:space="preserve">REKOMENDASI ALTERNATIF KEBIJAKAN </w:t>
+          <w:highlight w:val="yellow"/>
+          <w:rtl w:val="0"/>
+        </w:rPr>
+        <w:t>${field_005}</w:t>
+      </w:r>
+      <w:r>
+        <w:rPr>
+          <w:rtl w:val="0"/>
+        </w:rPr>
+      </w:r>
+    </w:p>
+    <w:p>
+      <w:pPr>
+        <w:jc w:val="center"/>
+        <w:rPr>
+          <w:rFonts w:ascii="Arial" w:cs="Arial" w:eastAsia="Arial" w:hAnsi="Arial"/>
+          <w:sz w:val="22"/>
+          <w:szCs w:val="22"/>
+        </w:rPr>
+      </w:pPr>
+      <w:r>
+        <w:rPr>
+          <w:rFonts w:ascii="Arial" w:cs="Arial" w:eastAsia="Arial" w:hAnsi="Arial"/>
+          <w:sz w:val="22"/>
+          <w:szCs w:val="22"/>
+          <w:rtl w:val="0"/>
+        </w:rPr>
+        <w:t xml:space="preserve">(</w:t>
       </w:r>
       <w:r>
         <w:rPr>
@@ -369,8 +512,27 @@
           <w:highlight w:val="yellow"/>
           <w:rtl w:val="0"/>
         </w:rPr>
-        <w:t>${field_003}</w:t>
-      </w:r>
+        <w:t>${field_006}</w:t>
+      </w:r>
+      <w:r>
+        <w:rPr>
+          <w:rFonts w:ascii="Arial" w:cs="Arial" w:eastAsia="Arial" w:hAnsi="Arial"/>
+          <w:sz w:val="22"/>
+          <w:szCs w:val="22"/>
+          <w:rtl w:val="0"/>
+        </w:rPr>
+        <w:t xml:space="preserve">)</w:t>
+      </w:r>
+    </w:p>
+    <w:p>
+      <w:pPr>
+        <w:jc w:val="center"/>
+        <w:rPr>
+          <w:rFonts w:ascii="Arial" w:cs="Arial" w:eastAsia="Arial" w:hAnsi="Arial"/>
+          <w:sz w:val="22"/>
+          <w:szCs w:val="22"/>
+        </w:rPr>
+      </w:pPr>
       <w:r>
         <w:rPr>
           <w:rtl w:val="0"/>
@@ -383,12 +545,76 @@
         <w:jc w:val="center"/>
         <w:rPr>
           <w:rFonts w:ascii="Arial" w:cs="Arial" w:eastAsia="Arial" w:hAnsi="Arial"/>
+          <w:sz w:val="22"/>
+          <w:szCs w:val="22"/>
+        </w:rPr>
+      </w:pPr>
+      <w:r>
+        <w:rPr>
+          <w:rFonts w:ascii="Arial" w:cs="Arial" w:eastAsia="Arial" w:hAnsi="Arial"/>
+          <w:sz w:val="22"/>
+          <w:szCs w:val="22"/>
+          <w:rtl w:val="0"/>
+        </w:rPr>
+        <w:t xml:space="preserve">KEGIATAN:</w:t>
+      </w:r>
+    </w:p>
+    <w:p>
+      <w:pPr>
+        <w:spacing w:after="0" w:lineRule="auto"/>
+        <w:jc w:val="center"/>
+        <w:rPr>
+          <w:rFonts w:ascii="Arial" w:cs="Arial" w:eastAsia="Arial" w:hAnsi="Arial"/>
+          <w:sz w:val="22"/>
+          <w:szCs w:val="22"/>
+        </w:rPr>
+      </w:pPr>
+      <w:r>
+        <w:rPr>
+          <w:rFonts w:ascii="Arial" w:cs="Arial" w:eastAsia="Arial" w:hAnsi="Arial"/>
+          <w:sz w:val="22"/>
+          <w:szCs w:val="22"/>
+          <w:rtl w:val="0"/>
+        </w:rPr>
+        <w:t xml:space="preserve">Kebijakan </w:t>
+      </w:r>
+      <w:r>
+        <w:rPr>
+          <w:rFonts w:ascii="Arial" w:cs="Arial" w:eastAsia="Arial" w:hAnsi="Arial"/>
           <w:b w:val="1"/>
           <w:bCs w:val="1"/>
           <w:sz w:val="22"/>
           <w:szCs w:val="22"/>
-        </w:rPr>
-      </w:pPr>
+          <w:highlight w:val="yellow"/>
+          <w:rtl w:val="0"/>
+        </w:rPr>
+        <w:t>${field_007}</w:t>
+      </w:r>
+      <w:r>
+        <w:rPr>
+          <w:rtl w:val="0"/>
+        </w:rPr>
+      </w:r>
+    </w:p>
+    <w:p>
+      <w:pPr>
+        <w:spacing w:after="0" w:lineRule="auto"/>
+        <w:jc w:val="center"/>
+        <w:rPr>
+          <w:rFonts w:ascii="Arial" w:cs="Arial" w:eastAsia="Arial" w:hAnsi="Arial"/>
+          <w:sz w:val="22"/>
+          <w:szCs w:val="22"/>
+        </w:rPr>
+      </w:pPr>
+      <w:r>
+        <w:rPr>
+          <w:rFonts w:ascii="Arial" w:cs="Arial" w:eastAsia="Arial" w:hAnsi="Arial"/>
+          <w:sz w:val="22"/>
+          <w:szCs w:val="22"/>
+          <w:rtl w:val="0"/>
+        </w:rPr>
+        <w:t xml:space="preserve">(</w:t>
+      </w:r>
       <w:r>
         <w:rPr>
           <w:rFonts w:ascii="Arial" w:cs="Arial" w:eastAsia="Arial" w:hAnsi="Arial"/>
@@ -396,22 +622,122 @@
           <w:bCs w:val="1"/>
           <w:sz w:val="22"/>
           <w:szCs w:val="22"/>
-          <w:rtl w:val="0"/>
-        </w:rPr>
-        <w:t xml:space="preserve">(</w:t>
-      </w:r>
-      <w:r>
+          <w:highlight w:val="yellow"/>
+          <w:rtl w:val="0"/>
+        </w:rPr>
+        <w:t>${field_008}</w:t>
+      </w:r>
+      <w:r>
+        <w:rPr>
+          <w:rFonts w:ascii="Arial" w:cs="Arial" w:eastAsia="Arial" w:hAnsi="Arial"/>
+          <w:sz w:val="22"/>
+          <w:szCs w:val="22"/>
+          <w:rtl w:val="0"/>
+        </w:rPr>
+        <w:t xml:space="preserve">)</w:t>
+      </w:r>
+    </w:p>
+    <w:p>
+      <w:pPr>
+        <w:jc w:val="center"/>
+        <w:rPr>
+          <w:rFonts w:ascii="Arial" w:cs="Arial" w:eastAsia="Arial" w:hAnsi="Arial"/>
+          <w:sz w:val="22"/>
+          <w:szCs w:val="22"/>
+        </w:rPr>
+      </w:pPr>
+      <w:r>
+        <w:rPr>
+          <w:rtl w:val="0"/>
+        </w:rPr>
+      </w:r>
+    </w:p>
+    <w:p>
+      <w:pPr>
+        <w:spacing w:after="0" w:lineRule="auto"/>
+        <w:jc w:val="center"/>
+        <w:rPr>
+          <w:rFonts w:ascii="Arial" w:cs="Arial" w:eastAsia="Arial" w:hAnsi="Arial"/>
+          <w:sz w:val="22"/>
+          <w:szCs w:val="22"/>
+        </w:rPr>
+      </w:pPr>
+      <w:r>
+        <w:rPr>
+          <w:rFonts w:ascii="Arial" w:cs="Arial" w:eastAsia="Arial" w:hAnsi="Arial"/>
+          <w:sz w:val="22"/>
+          <w:szCs w:val="22"/>
+          <w:rtl w:val="0"/>
+        </w:rPr>
+        <w:t xml:space="preserve">PROGRAM:</w:t>
+      </w:r>
+    </w:p>
+    <w:p>
+      <w:pPr>
+        <w:spacing w:after="0" w:lineRule="auto"/>
+        <w:jc w:val="center"/>
+        <w:rPr>
+          <w:rFonts w:ascii="Arial" w:cs="Arial" w:eastAsia="Arial" w:hAnsi="Arial"/>
+          <w:sz w:val="22"/>
+          <w:szCs w:val="22"/>
+        </w:rPr>
+      </w:pPr>
+      <w:r>
+        <w:rPr>
+          <w:rFonts w:ascii="Arial" w:cs="Arial" w:eastAsia="Arial" w:hAnsi="Arial"/>
+          <w:sz w:val="22"/>
+          <w:szCs w:val="22"/>
+          <w:rtl w:val="0"/>
+        </w:rPr>
+        <w:t xml:space="preserve">Koordinasi Pelaksanaan Kebijakan Pembangunan Manusia dan Kebudayaan</w:t>
+      </w:r>
+    </w:p>
+    <w:p>
+      <w:pPr>
+        <w:jc w:val="center"/>
+        <w:rPr>
+          <w:rFonts w:ascii="Arial" w:cs="Arial" w:eastAsia="Arial" w:hAnsi="Arial"/>
+          <w:sz w:val="22"/>
+          <w:szCs w:val="22"/>
+        </w:rPr>
+      </w:pPr>
+      <w:r>
+        <w:rPr>
+          <w:rFonts w:ascii="Arial" w:cs="Arial" w:eastAsia="Arial" w:hAnsi="Arial"/>
+          <w:sz w:val="22"/>
+          <w:szCs w:val="22"/>
+          <w:rtl w:val="0"/>
+        </w:rPr>
+        <w:t xml:space="preserve">(036.CL)</w:t>
+      </w:r>
+    </w:p>
+    <w:p>
+      <w:pPr>
+        <w:spacing w:after="0" w:line="288" w:lineRule="auto"/>
+        <w:rPr>
+          <w:rFonts w:ascii="Arial" w:cs="Arial" w:eastAsia="Arial" w:hAnsi="Arial"/>
+          <w:sz w:val="22"/>
+          <w:szCs w:val="22"/>
+        </w:rPr>
+      </w:pPr>
+      <w:r>
+        <w:rPr>
+          <w:rtl w:val="0"/>
+        </w:rPr>
+      </w:r>
+    </w:p>
+    <w:p>
+      <w:pPr>
+        <w:spacing w:after="0" w:line="288" w:lineRule="auto"/>
+        <w:jc w:val="center"/>
         <w:rPr>
           <w:rFonts w:ascii="Arial" w:cs="Arial" w:eastAsia="Arial" w:hAnsi="Arial"/>
           <w:b w:val="1"/>
           <w:bCs w:val="1"/>
           <w:sz w:val="22"/>
           <w:szCs w:val="22"/>
-          <w:highlight w:val="yellow"/>
-          <w:rtl w:val="0"/>
-        </w:rPr>
-        <w:t>${field_004}</w:t>
-      </w:r>
+        </w:rPr>
+      </w:pPr>
       <w:r>
         <w:rPr>
           <w:rFonts w:ascii="Arial" w:cs="Arial" w:eastAsia="Arial" w:hAnsi="Arial"/>
@@ -421,102 +747,38 @@
           <w:szCs w:val="22"/>
           <w:rtl w:val="0"/>
         </w:rPr>
-        <w:t xml:space="preserve">)</w:t>
-      </w:r>
-    </w:p>
-    <w:p>
-      <w:pPr>
-        <w:spacing w:after="0" w:lineRule="auto"/>
-        <w:jc w:val="center"/>
+        <w:t xml:space="preserve">DEPUTI BIDANG </w:t>
+      </w:r>
+      <w:r>
         <w:rPr>
           <w:rFonts w:ascii="Arial" w:cs="Arial" w:eastAsia="Arial" w:hAnsi="Arial"/>
           <w:b w:val="1"/>
           <w:bCs w:val="1"/>
           <w:sz w:val="22"/>
           <w:szCs w:val="22"/>
-        </w:rPr>
-      </w:pPr>
-      <w:r>
-        <w:rPr>
-          <w:rtl w:val="0"/>
-        </w:rPr>
-      </w:r>
-    </w:p>
-    <w:p>
-      <w:pPr>
-        <w:spacing w:after="0" w:lineRule="auto"/>
+          <w:highlight w:val="yellow"/>
+          <w:rtl w:val="0"/>
+        </w:rPr>
+        <w:t>${field_009}</w:t>
+      </w:r>
+      <w:r>
+        <w:rPr>
+          <w:rtl w:val="0"/>
+        </w:rPr>
+      </w:r>
+    </w:p>
+    <w:p>
+      <w:pPr>
+        <w:spacing w:after="0" w:line="288" w:lineRule="auto"/>
         <w:jc w:val="center"/>
-        <w:rPr>
-          <w:rFonts w:ascii="Arial" w:cs="Arial" w:eastAsia="Arial" w:hAnsi="Arial"/>
-          <w:sz w:val="22"/>
-          <w:szCs w:val="22"/>
-        </w:rPr>
-      </w:pPr>
-      <w:r>
-        <w:rPr>
-          <w:rFonts w:ascii="Arial" w:cs="Arial" w:eastAsia="Arial" w:hAnsi="Arial"/>
-          <w:sz w:val="22"/>
-          <w:szCs w:val="22"/>
-          <w:rtl w:val="0"/>
-        </w:rPr>
-        <w:t xml:space="preserve">KLASIFIKASI RINCIAN OUTPUT (KRO):</w:t>
-      </w:r>
-    </w:p>
-    <w:p>
-      <w:pPr>
-        <w:spacing w:after="0" w:lineRule="auto"/>
-        <w:jc w:val="center"/>
-        <w:rPr>
-          <w:rFonts w:ascii="Arial" w:cs="Arial" w:eastAsia="Arial" w:hAnsi="Arial"/>
-          <w:sz w:val="22"/>
-          <w:szCs w:val="22"/>
-        </w:rPr>
-      </w:pPr>
-      <w:r>
-        <w:rPr>
-          <w:rFonts w:ascii="Arial" w:cs="Arial" w:eastAsia="Arial" w:hAnsi="Arial"/>
-          <w:sz w:val="22"/>
-          <w:szCs w:val="22"/>
-          <w:rtl w:val="0"/>
-        </w:rPr>
-        <w:t xml:space="preserve">Kebijakan Bidang </w:t>
-      </w:r>
-      <w:r>
         <w:rPr>
           <w:rFonts w:ascii="Arial" w:cs="Arial" w:eastAsia="Arial" w:hAnsi="Arial"/>
           <w:b w:val="1"/>
           <w:bCs w:val="1"/>
           <w:sz w:val="22"/>
           <w:szCs w:val="22"/>
-          <w:highlight w:val="yellow"/>
-          <w:rtl w:val="0"/>
-        </w:rPr>
-        <w:t>${field_005}</w:t>
-      </w:r>
-      <w:r>
-        <w:rPr>
-          <w:rtl w:val="0"/>
-        </w:rPr>
-      </w:r>
-    </w:p>
-    <w:p>
-      <w:pPr>
-        <w:jc w:val="center"/>
-        <w:rPr>
-          <w:rFonts w:ascii="Arial" w:cs="Arial" w:eastAsia="Arial" w:hAnsi="Arial"/>
-          <w:sz w:val="22"/>
-          <w:szCs w:val="22"/>
-        </w:rPr>
-      </w:pPr>
-      <w:r>
-        <w:rPr>
-          <w:rFonts w:ascii="Arial" w:cs="Arial" w:eastAsia="Arial" w:hAnsi="Arial"/>
-          <w:sz w:val="22"/>
-          <w:szCs w:val="22"/>
-          <w:rtl w:val="0"/>
-        </w:rPr>
-        <w:t xml:space="preserve">(</w:t>
-      </w:r>
+        </w:rPr>
+      </w:pPr>
       <w:r>
         <w:rPr>
           <w:rFonts w:ascii="Arial" w:cs="Arial" w:eastAsia="Arial" w:hAnsi="Arial"/>
@@ -524,112 +786,23 @@
           <w:bCs w:val="1"/>
           <w:sz w:val="22"/>
           <w:szCs w:val="22"/>
-          <w:highlight w:val="yellow"/>
-          <w:rtl w:val="0"/>
-        </w:rPr>
-        <w:t>${field_006}</w:t>
-      </w:r>
-      <w:r>
-        <w:rPr>
-          <w:rFonts w:ascii="Arial" w:cs="Arial" w:eastAsia="Arial" w:hAnsi="Arial"/>
-          <w:sz w:val="22"/>
-          <w:szCs w:val="22"/>
-          <w:rtl w:val="0"/>
-        </w:rPr>
-        <w:t xml:space="preserve">)</w:t>
-      </w:r>
-    </w:p>
-    <w:p>
-      <w:pPr>
+          <w:rtl w:val="0"/>
+        </w:rPr>
+        <w:t xml:space="preserve">KEMENTERIAN KOORDINATOR BIDANG PEMBANGUNAN MANUSIA DAN KEBUDAYAAN</w:t>
+      </w:r>
+    </w:p>
+    <w:p>
+      <w:pPr>
+        <w:ind w:left="2020" w:right="2020" w:firstLine="0"/>
         <w:jc w:val="center"/>
-        <w:rPr>
-          <w:rFonts w:ascii="Arial" w:cs="Arial" w:eastAsia="Arial" w:hAnsi="Arial"/>
-          <w:sz w:val="22"/>
-          <w:szCs w:val="22"/>
-        </w:rPr>
-      </w:pPr>
-      <w:r>
-        <w:rPr>
-          <w:rtl w:val="0"/>
-        </w:rPr>
-      </w:r>
-    </w:p>
-    <w:p>
-      <w:pPr>
-        <w:spacing w:after="0" w:lineRule="auto"/>
-        <w:jc w:val="center"/>
-        <w:rPr>
-          <w:rFonts w:ascii="Arial" w:cs="Arial" w:eastAsia="Arial" w:hAnsi="Arial"/>
-          <w:sz w:val="22"/>
-          <w:szCs w:val="22"/>
-        </w:rPr>
-      </w:pPr>
-      <w:r>
-        <w:rPr>
-          <w:rFonts w:ascii="Arial" w:cs="Arial" w:eastAsia="Arial" w:hAnsi="Arial"/>
-          <w:sz w:val="22"/>
-          <w:szCs w:val="22"/>
-          <w:rtl w:val="0"/>
-        </w:rPr>
-        <w:t xml:space="preserve">KEGIATAN:</w:t>
-      </w:r>
-    </w:p>
-    <w:p>
-      <w:pPr>
-        <w:spacing w:after="0" w:lineRule="auto"/>
-        <w:jc w:val="center"/>
-        <w:rPr>
-          <w:rFonts w:ascii="Arial" w:cs="Arial" w:eastAsia="Arial" w:hAnsi="Arial"/>
-          <w:sz w:val="22"/>
-          <w:szCs w:val="22"/>
-        </w:rPr>
-      </w:pPr>
-      <w:r>
-        <w:rPr>
-          <w:rFonts w:ascii="Arial" w:cs="Arial" w:eastAsia="Arial" w:hAnsi="Arial"/>
-          <w:sz w:val="22"/>
-          <w:szCs w:val="22"/>
-          <w:rtl w:val="0"/>
-        </w:rPr>
-        <w:t xml:space="preserve">Kebijakan </w:t>
-      </w:r>
-      <w:r>
         <w:rPr>
           <w:rFonts w:ascii="Arial" w:cs="Arial" w:eastAsia="Arial" w:hAnsi="Arial"/>
           <w:b w:val="1"/>
           <w:bCs w:val="1"/>
           <w:sz w:val="22"/>
           <w:szCs w:val="22"/>
-          <w:highlight w:val="yellow"/>
-          <w:rtl w:val="0"/>
-        </w:rPr>
-        <w:t>${field_007}</w:t>
-      </w:r>
-      <w:r>
-        <w:rPr>
-          <w:rtl w:val="0"/>
-        </w:rPr>
-      </w:r>
-    </w:p>
-    <w:p>
-      <w:pPr>
-        <w:spacing w:after="0" w:lineRule="auto"/>
-        <w:jc w:val="center"/>
-        <w:rPr>
-          <w:rFonts w:ascii="Arial" w:cs="Arial" w:eastAsia="Arial" w:hAnsi="Arial"/>
-          <w:sz w:val="22"/>
-          <w:szCs w:val="22"/>
-        </w:rPr>
-      </w:pPr>
-      <w:r>
-        <w:rPr>
-          <w:rFonts w:ascii="Arial" w:cs="Arial" w:eastAsia="Arial" w:hAnsi="Arial"/>
-          <w:sz w:val="22"/>
-          <w:szCs w:val="22"/>
-          <w:rtl w:val="0"/>
-        </w:rPr>
-        <w:t xml:space="preserve">(</w:t>
-      </w:r>
+        </w:rPr>
+      </w:pPr>
       <w:r>
         <w:rPr>
           <w:rFonts w:ascii="Arial" w:cs="Arial" w:eastAsia="Arial" w:hAnsi="Arial"/>
@@ -637,278 +810,22 @@
           <w:bCs w:val="1"/>
           <w:sz w:val="22"/>
           <w:szCs w:val="22"/>
-          <w:highlight w:val="yellow"/>
-          <w:rtl w:val="0"/>
-        </w:rPr>
-        <w:t>${field_008}</w:t>
-      </w:r>
-      <w:r>
-        <w:rPr>
-          <w:rFonts w:ascii="Arial" w:cs="Arial" w:eastAsia="Arial" w:hAnsi="Arial"/>
-          <w:sz w:val="22"/>
-          <w:szCs w:val="22"/>
-          <w:rtl w:val="0"/>
-        </w:rPr>
-        <w:t xml:space="preserve">)</w:t>
-      </w:r>
-    </w:p>
-    <w:p>
-      <w:pPr>
-        <w:jc w:val="center"/>
-        <w:rPr>
-          <w:rFonts w:ascii="Arial" w:cs="Arial" w:eastAsia="Arial" w:hAnsi="Arial"/>
-          <w:sz w:val="22"/>
-          <w:szCs w:val="22"/>
-        </w:rPr>
-      </w:pPr>
-      <w:r>
-        <w:rPr>
-          <w:rtl w:val="0"/>
-        </w:rPr>
-      </w:r>
-    </w:p>
-    <w:p>
-      <w:pPr>
-        <w:spacing w:after="0" w:lineRule="auto"/>
-        <w:jc w:val="center"/>
-        <w:rPr>
-          <w:rFonts w:ascii="Arial" w:cs="Arial" w:eastAsia="Arial" w:hAnsi="Arial"/>
-          <w:sz w:val="22"/>
-          <w:szCs w:val="22"/>
-        </w:rPr>
-      </w:pPr>
-      <w:r>
-        <w:rPr>
-          <w:rFonts w:ascii="Arial" w:cs="Arial" w:eastAsia="Arial" w:hAnsi="Arial"/>
-          <w:sz w:val="22"/>
-          <w:szCs w:val="22"/>
-          <w:rtl w:val="0"/>
-        </w:rPr>
-        <w:t xml:space="preserve">PROGRAM:</w:t>
-      </w:r>
-    </w:p>
-    <w:p>
-      <w:pPr>
-        <w:spacing w:after="0" w:lineRule="auto"/>
-        <w:jc w:val="center"/>
-        <w:rPr>
-          <w:rFonts w:ascii="Arial" w:cs="Arial" w:eastAsia="Arial" w:hAnsi="Arial"/>
-          <w:sz w:val="22"/>
-          <w:szCs w:val="22"/>
-        </w:rPr>
-      </w:pPr>
-      <w:r>
-        <w:rPr>
-          <w:rFonts w:ascii="Arial" w:cs="Arial" w:eastAsia="Arial" w:hAnsi="Arial"/>
-          <w:sz w:val="22"/>
-          <w:szCs w:val="22"/>
-          <w:rtl w:val="0"/>
-        </w:rPr>
-        <w:t xml:space="preserve">Koordinasi Pelaksanaan Kebijakan Pembangunan Manusia dan Kebudayaan</w:t>
-      </w:r>
-    </w:p>
-    <w:p>
-      <w:pPr>
-        <w:jc w:val="center"/>
-        <w:rPr>
-          <w:rFonts w:ascii="Arial" w:cs="Arial" w:eastAsia="Arial" w:hAnsi="Arial"/>
-          <w:sz w:val="22"/>
-          <w:szCs w:val="22"/>
-        </w:rPr>
-      </w:pPr>
-      <w:r>
-        <w:rPr>
-          <w:rFonts w:ascii="Arial" w:cs="Arial" w:eastAsia="Arial" w:hAnsi="Arial"/>
-          <w:sz w:val="22"/>
-          <w:szCs w:val="22"/>
-          <w:rtl w:val="0"/>
-        </w:rPr>
-        <w:t xml:space="preserve">(036.CL)</w:t>
-      </w:r>
-    </w:p>
-    <w:p>
-      <w:pPr>
-        <w:spacing w:after="0" w:line="288" w:lineRule="auto"/>
-        <w:rPr>
-          <w:rFonts w:ascii="Arial" w:cs="Arial" w:eastAsia="Arial" w:hAnsi="Arial"/>
-          <w:sz w:val="22"/>
-          <w:szCs w:val="22"/>
-        </w:rPr>
-      </w:pPr>
-      <w:r>
-        <w:rPr>
-          <w:rtl w:val="0"/>
-        </w:rPr>
-      </w:r>
-    </w:p>
-    <w:p>
-      <w:pPr>
-        <w:spacing w:after="0" w:line="288" w:lineRule="auto"/>
-        <w:jc w:val="center"/>
-        <w:rPr>
-          <w:rFonts w:ascii="Arial" w:cs="Arial" w:eastAsia="Arial" w:hAnsi="Arial"/>
-          <w:sz w:val="22"/>
-          <w:szCs w:val="22"/>
-        </w:rPr>
-      </w:pPr>
-      <w:r>
-        <w:rPr>
-          <w:rtl w:val="0"/>
-        </w:rPr>
-      </w:r>
-    </w:p>
-    <w:p>
-      <w:pPr>
-        <w:spacing w:after="0" w:line="288" w:lineRule="auto"/>
-        <w:jc w:val="center"/>
+          <w:rtl w:val="0"/>
+        </w:rPr>
+        <w:t xml:space="preserve">TAHUN </w:t>
+      </w:r>
+      <w:r>
         <w:rPr>
           <w:rFonts w:ascii="Arial" w:cs="Arial" w:eastAsia="Arial" w:hAnsi="Arial"/>
           <w:b w:val="1"/>
           <w:bCs w:val="1"/>
           <w:sz w:val="22"/>
           <w:szCs w:val="22"/>
-        </w:rPr>
-      </w:pPr>
-      <w:r>
-        <w:rPr>
-          <w:rFonts w:ascii="Arial" w:cs="Arial" w:eastAsia="Arial" w:hAnsi="Arial"/>
-          <w:b w:val="1"/>
-          <w:bCs w:val="1"/>
-          <w:sz w:val="22"/>
-          <w:szCs w:val="22"/>
-          <w:rtl w:val="0"/>
-        </w:rPr>
-        <w:t xml:space="preserve">DEPUTI BIDANG </w:t>
-      </w:r>
-      <w:r>
-        <w:rPr>
-          <w:rFonts w:ascii="Arial" w:cs="Arial" w:eastAsia="Arial" w:hAnsi="Arial"/>
-          <w:b w:val="1"/>
-          <w:bCs w:val="1"/>
-          <w:sz w:val="22"/>
-          <w:szCs w:val="22"/>
-          <w:highlight w:val="yellow"/>
-          <w:rtl w:val="0"/>
-        </w:rPr>
-        <w:t>${field_009}</w:t>
-      </w:r>
-      <w:r>
-        <w:rPr>
-          <w:rtl w:val="0"/>
-        </w:rPr>
-      </w:r>
-    </w:p>
-    <w:p>
-      <w:pPr>
-        <w:spacing w:after="0" w:line="288" w:lineRule="auto"/>
-        <w:jc w:val="center"/>
-        <w:rPr>
-          <w:rFonts w:ascii="Arial" w:cs="Arial" w:eastAsia="Arial" w:hAnsi="Arial"/>
-          <w:b w:val="1"/>
-          <w:bCs w:val="1"/>
-          <w:sz w:val="22"/>
-          <w:szCs w:val="22"/>
-        </w:rPr>
-      </w:pPr>
-      <w:r>
-        <w:rPr>
-          <w:rFonts w:ascii="Arial" w:cs="Arial" w:eastAsia="Arial" w:hAnsi="Arial"/>
-          <w:b w:val="1"/>
-          <w:bCs w:val="1"/>
-          <w:sz w:val="22"/>
-          <w:szCs w:val="22"/>
-          <w:rtl w:val="0"/>
-        </w:rPr>
-        <w:t xml:space="preserve">KEMENTERIAN KOORDINATOR BIDANG PEMBANGUNAN MANUSIA DAN KEBUDAYAAN</w:t>
-      </w:r>
-    </w:p>
-    <w:p>
-      <w:pPr>
-        <w:ind w:left="2020" w:right="2020" w:firstLine="0"/>
-        <w:jc w:val="center"/>
-        <w:rPr>
-          <w:rFonts w:ascii="Arial" w:cs="Arial" w:eastAsia="Arial" w:hAnsi="Arial"/>
-          <w:b w:val="1"/>
-          <w:bCs w:val="1"/>
-          <w:sz w:val="22"/>
-          <w:szCs w:val="22"/>
-        </w:rPr>
-      </w:pPr>
-      <w:r>
-        <w:rPr>
-          <w:rFonts w:ascii="Arial" w:cs="Arial" w:eastAsia="Arial" w:hAnsi="Arial"/>
-          <w:b w:val="1"/>
-          <w:bCs w:val="1"/>
-          <w:sz w:val="22"/>
-          <w:szCs w:val="22"/>
-          <w:rtl w:val="0"/>
-        </w:rPr>
-        <w:t xml:space="preserve">TAHUN </w:t>
-      </w:r>
-      <w:r>
-        <w:rPr>
-          <w:rFonts w:ascii="Arial" w:cs="Arial" w:eastAsia="Arial" w:hAnsi="Arial"/>
-          <w:b w:val="1"/>
-          <w:bCs w:val="1"/>
-          <w:sz w:val="22"/>
-          <w:szCs w:val="22"/>
           <w:highlight w:val="yellow"/>
           <w:rtl w:val="0"/>
         </w:rPr>
         <w:t>${field_010}</w:t>
       </w:r>
-      <w:r>
-        <w:rPr>
-          <w:rtl w:val="0"/>
-        </w:rPr>
-      </w:r>
-    </w:p>
-    <w:p>
-      <w:pPr>
-        <w:spacing w:line="360" w:lineRule="auto"/>
-        <w:jc w:val="center"/>
-        <w:rPr>
-          <w:rFonts w:ascii="Arial" w:cs="Arial" w:eastAsia="Arial" w:hAnsi="Arial"/>
-          <w:b w:val="1"/>
-          <w:bCs w:val="1"/>
-          <w:sz w:val="22"/>
-          <w:szCs w:val="22"/>
-        </w:rPr>
-      </w:pPr>
-      <w:r>
-        <w:rPr>
-          <w:rtl w:val="0"/>
-        </w:rPr>
-      </w:r>
-    </w:p>
-    <w:p>
-      <w:pPr>
-        <w:spacing w:line="360" w:lineRule="auto"/>
-        <w:rPr>
-          <w:rFonts w:ascii="Arial" w:cs="Arial" w:eastAsia="Arial" w:hAnsi="Arial"/>
-          <w:b w:val="1"/>
-          <w:bCs w:val="1"/>
-          <w:sz w:val="22"/>
-          <w:szCs w:val="22"/>
-        </w:rPr>
-      </w:pPr>
-      <w:r>
-        <w:rPr>
-          <w:rtl w:val="0"/>
-        </w:rPr>
-      </w:r>
-    </w:p>
-    <w:p>
-      <w:pPr>
-        <w:spacing w:line="360" w:lineRule="auto"/>
-        <w:rPr>
-          <w:rFonts w:ascii="Arial" w:cs="Arial" w:eastAsia="Arial" w:hAnsi="Arial"/>
-          <w:b w:val="1"/>
-          <w:bCs w:val="1"/>
-          <w:sz w:val="22"/>
-          <w:szCs w:val="22"/>
-        </w:rPr>
-      </w:pPr>
       <w:r>
         <w:rPr>
           <w:rtl w:val="0"/>

</xml_diff>